<commit_message>
Deploying to gh-pages from @ Morrison-Lab/sds@da27ab57250846f81ce4794aad418c6700741200 🚀
</commit_message>
<xml_diff>
--- a/prediction-handout.docx
+++ b/prediction-handout.docx
@@ -15,7 +15,7 @@
         <w:pStyle w:val="Date"/>
       </w:pPr>
       <w:r>
-        <w:t xml:space="preserve">Last modified: 2026-10-17 07:29:54 (PDT)</w:t>
+        <w:t xml:space="preserve">Last modified: 2026-10-17 07:59:21 (PDT)</w:t>
       </w:r>
     </w:p>
     <w:bookmarkStart w:id="26" w:name="sec-predictions"/>
@@ -89,19 +89,23 @@
           </m:e>
         </m:acc>
         <m:r>
-          <m:rPr>
-            <m:sty m:val="p"/>
-          </m:rPr>
-          <m:t>(</m:t>
+          <m:t>​</m:t>
         </m:r>
+        <m:d>
+          <m:dPr>
+            <m:begChr m:val="("/>
+            <m:sepChr m:val=""/>
+            <m:endChr m:val=")"/>
+            <m:grow/>
+          </m:dPr>
+          <m:e>
+            <m:r>
+              <m:t>x</m:t>
+            </m:r>
+          </m:e>
+        </m:d>
         <m:r>
-          <m:t>x</m:t>
-        </m:r>
-        <m:r>
-          <m:rPr>
-            <m:sty m:val="p"/>
-          </m:rPr>
-          <m:t>)</m:t>
+          <m:t>​</m:t>
         </m:r>
       </m:oMath>
       <w:r>
@@ -317,19 +321,23 @@
             </m:e>
           </m:acc>
           <m:r>
-            <m:rPr>
-              <m:sty m:val="p"/>
-            </m:rPr>
-            <m:t>(</m:t>
+            <m:t>​</m:t>
           </m:r>
+          <m:d>
+            <m:dPr>
+              <m:begChr m:val="("/>
+              <m:sepChr m:val=""/>
+              <m:endChr m:val=")"/>
+              <m:grow/>
+            </m:dPr>
+            <m:e>
+              <m:r>
+                <m:t>x</m:t>
+              </m:r>
+            </m:e>
+          </m:d>
           <m:r>
-            <m:t>x</m:t>
-          </m:r>
-          <m:r>
-            <m:rPr>
-              <m:sty m:val="p"/>
-            </m:rPr>
-            <m:t>)</m:t>
+            <m:t>​</m:t>
           </m:r>
           <m:limUpp>
             <m:e>
@@ -670,7 +678,7 @@
         <w:pStyle w:val="BodyText"/>
       </w:pPr>
       <w:r>
-        <w:t xml:space="preserve">$$\hat y(x) = \mu(x; \hat{\mathord{\smash[b]{\underset{\raise.3ex\hbox{$\scriptstyle\sim$}}{\theta}}\vphantom{\theta}}}).$$</w:t>
+        <w:t xml:space="preserve">$${\hat y\mathopen{}\left(x\right)\mathclose{}} = \mu(x; \hat{\mathord{\smash[b]{\underset{\raise.3ex\hbox{$\scriptstyle\sim$}}{\theta}}\vphantom{\theta}}}).$$</w:t>
       </w:r>
     </w:p>
     <w:bookmarkEnd w:id="10"/>
@@ -1091,28 +1099,32 @@
             </m:e>
           </m:acc>
           <m:r>
-            <m:rPr>
-              <m:sty m:val="p"/>
-            </m:rPr>
-            <m:t>(</m:t>
+            <m:t>​</m:t>
           </m:r>
-          <m:sSub>
+          <m:d>
+            <m:dPr>
+              <m:begChr m:val="("/>
+              <m:sepChr m:val=""/>
+              <m:endChr m:val=")"/>
+              <m:grow/>
+            </m:dPr>
             <m:e>
-              <m:r>
-                <m:t>x</m:t>
-              </m:r>
+              <m:sSub>
+                <m:e>
+                  <m:r>
+                    <m:t>x</m:t>
+                  </m:r>
+                </m:e>
+                <m:sub>
+                  <m:r>
+                    <m:t>i</m:t>
+                  </m:r>
+                </m:sub>
+              </m:sSub>
             </m:e>
-            <m:sub>
-              <m:r>
-                <m:t>i</m:t>
-              </m:r>
-            </m:sub>
-          </m:sSub>
+          </m:d>
           <m:r>
-            <m:rPr>
-              <m:sty m:val="p"/>
-            </m:rPr>
-            <m:t>)</m:t>
+            <m:t>​</m:t>
           </m:r>
           <m:r>
             <m:rPr>
@@ -1485,19 +1497,23 @@
           </m:e>
         </m:acc>
         <m:r>
-          <m:rPr>
-            <m:sty m:val="p"/>
-          </m:rPr>
-          <m:t>(</m:t>
+          <m:t>​</m:t>
         </m:r>
+        <m:d>
+          <m:dPr>
+            <m:begChr m:val="("/>
+            <m:sepChr m:val=""/>
+            <m:endChr m:val=")"/>
+            <m:grow/>
+          </m:dPr>
+          <m:e>
+            <m:r>
+              <m:t>x</m:t>
+            </m:r>
+          </m:e>
+        </m:d>
         <m:r>
-          <m:t>x</m:t>
-        </m:r>
-        <m:r>
-          <m:rPr>
-            <m:sty m:val="p"/>
-          </m:rPr>
-          <m:t>)</m:t>
+          <m:t>​</m:t>
         </m:r>
       </m:oMath>
       <w:r>

</xml_diff>